<commit_message>
Zrusene vstupni kody: opravy zbylych textu, tip v laboratori, plany hodin
- Simulatory: misto "kodem od vyucujiciho" prihlaseni jmenem (stranka /windows,
  Nastaveni ve Windows i na Macu, komentar ve stav.ts)
- Pracovni list 1: do virtualnich Windows se zak prihlasi svym jmenem
- Laborator site, modul 02: tip obecne "jinemu zarizeni v siti", zak muze
  poslat obalku komukoli
- Plany 4 a 6: odkaz "banka -> Digitalni gramotnost -> lekce 4/6";
  harmonogram hodiny 4 (faze 14-22) promita modul 05 jako metodicka poznamka
- Pevne mezery po jednopismennych predlozkach v planech 4, 6 a listech 1, 6
- CLAUDE.md: predavka o dnesni lokalni praci

Overeno: tsc, vitest 559/559, ES5 laboratore, lokalni web (laborator,
/windows, Nastaveni ve Windows), plany a listy exportovane z Wordu

Co-Authored-By: Claude Opus 5.5 <noreply@anthropic.com>
</commit_message>
<xml_diff>
--- a/public/materialy/1L/2/Pracovní listy/1. Operační systém.docx
+++ b/public/materialy/1L/2/Pracovní listy/1. Operační systém.docx
@@ -229,7 +229,7 @@
         <w:t xml:space="preserve">Nemáš po ruce školní Windows? </w:t>
       </w:r>
       <w:r>
-        <w:t xml:space="preserve">Úkoly 1 až 3 zvládneš i ve virtuálním počítači na karelhlas.vercel.app/windows — běží v prohlížeči, nic se neinstaluje a vejdeš tam kódem od vyučujícího. Nastavení, Systém → O systému i Přizpůsobení → Pozadí tam najdeš na stejných místech. Snímek obrazovky si v něm udělej výřezem svého vlastního počítače.</w:t>
+        <w:t xml:space="preserve">Úkoly 1 až 3 zvládneš i ve virtuálním počítači na karelhlas.vercel.app/windows — běží v prohlížeči, nic se neinstaluje a přihlásíš se svým jménem. Nastavení, Systém → O systému i Přizpůsobení → Pozadí tam najdeš na stejných místech. Snímek obrazovky si v něm udělej výřezem svého vlastního počítače.</w:t>
       </w:r>
     </w:p>
     <w:p>
@@ -744,7 +744,7 @@
       </w:r>
       <w:r>
         <w:rPr/>
-        <w:t>otevři virtuální Mac na karelhlas.vercel.app/macos (přihlásíš se jménem) a splň úkoly ze skupiny Okno není program. Pak ve Windows zavři okno křížkem a porovnej. Co se stalo jinak? Proč to podle tebe autoři systémů udělali každý po svém? Odpověz dvěma větami na konec dokumentu.</w:t>
+        <w:t>otevři virtuální Mac na karelhlas.vercel.app/macos (přihlásíš se jménem) a splň úkoly ze skupiny Okno není program. Pak ve Windows zavři okno křížkem a porovnej. Co se stalo jinak? Proč to podle tebe autoři systémů udělali každý po svém? Odpověz dvěma větami na konec dokumentu.</w:t>
       </w:r>
     </w:p>
     <w:sectPr>

</xml_diff>